<commit_message>
Incorporate Manas/Jai feedback, add team assignments (Section 10)
Tightens Solution Statement and the revenue-lift assumption language
per Manas's notes (7/24) - sharper "doesn't give hosts enough evidence
to trust and act" framing, and explicit attribution of the
opportunity-vs-causal-uplift caveat to his own stated model
limitation.

Flags two items Jai raised (7/24) as open notes for him to action
rather than computing them here: the 5-year ROI figures are nominal,
never actually discounted despite naming NPV as the methodology; and
the $190K build cost is a greenfield estimate that likely overstates
Airbnb's real marginal cost given existing internal infra.

Adds Section 10 capturing the team's role assignments decided
7/24-25 (Manas leading script/message, Francois+Rachael supporting,
Jai on financials/model robustness, Brendan on appendices, UI
branding still unassigned) and the Saturday meeting objective.

Co-Authored-By: Claude Sonnet 5 <noreply@anthropic.com>
</commit_message>
<xml_diff>
--- a/Presentation Planning Notes.docx
+++ b/Presentation Planning Notes.docx
@@ -2,7 +2,7 @@
 <file path=word/document.xml><?xml version="1.0" encoding="utf-8"?>
 <w:document xmlns:w="http://schemas.openxmlformats.org/wordprocessingml/2006/main" xmlns:m="http://schemas.openxmlformats.org/officeDocument/2006/math" xmlns:r="http://schemas.openxmlformats.org/officeDocument/2006/relationships" xmlns:o="urn:schemas-microsoft-com:office:office" xmlns:v="urn:schemas-microsoft-com:vml" xmlns:w10="urn:schemas-microsoft-com:office:word" xmlns:a="http://schemas.openxmlformats.org/drawingml/2006/main" xmlns:pic="http://schemas.openxmlformats.org/drawingml/2006/picture" xmlns:wp="http://schemas.openxmlformats.org/drawingml/2006/wordprocessingDrawing">
   <w:body>
-    <w:bookmarkStart w:id="23" w:name="presentation-planning-notes"/>
+    <w:bookmarkStart w:id="24" w:name="presentation-planning-notes"/>
     <w:p>
       <w:pPr>
         <w:pStyle w:val="Heading1"/>
@@ -889,7 +889,7 @@
         <w:t xml:space="preserve"> </w:t>
       </w:r>
       <w:r>
-        <w:t xml:space="preserve">&gt; The product still gives hosts a recommended optimal price, same as Smart Pricing, but goes further: it shows the host where that price sits relative to real comps, explains why, and lets them test different price points themselves.</w:t>
+        <w:t xml:space="preserve">&gt; Airbnb already recommends prices, but it doesn’t give hosts enough evidence to trust and act on those recommendations. This product does: it shows the host where their price sits relative to real comps, explains why, and lets them test different price points themselves.</w:t>
       </w:r>
     </w:p>
     <w:p>
@@ -907,7 +907,19 @@
         <w:t xml:space="preserve"> </w:t>
       </w:r>
       <w:r>
-        <w:t xml:space="preserve">- Key differentiator is agency + explainability, not a different price output.</w:t>
+        <w:t xml:space="preserve">- Key differentiator is agency + explainability, not a different price output. (Framing above tightened per Manas’s note, 7/24 — sharper version of the same</w:t>
+      </w:r>
+      <w:r>
+        <w:t xml:space="preserve"> </w:t>
+      </w:r>
+      <w:r>
+        <w:t xml:space="preserve">“goes further than Smart Pricing”</w:t>
+      </w:r>
+      <w:r>
+        <w:t xml:space="preserve"> </w:t>
+      </w:r>
+      <w:r>
+        <w:t xml:space="preserve">point.)</w:t>
       </w:r>
       <w:r>
         <w:t xml:space="preserve"> </w:t>
@@ -1118,13 +1130,26 @@
           <w:b/>
           <w:bCs/>
         </w:rPr>
-        <w:t xml:space="preserve">Working assumption (explicit, presentation-only):</w:t>
-      </w:r>
-      <w:r>
-        <w:t xml:space="preserve"> </w:t>
-      </w:r>
-      <w:r>
-        <w:t xml:space="preserve">presenting from inside Airbnb, so assuming access to real occupancy-response data Airbnb would have but this team’s dataset doesn’t. Moving an underpriced listing to fair value is treated as roughly occupancy-neutral.</w:t>
+        <w:t xml:space="preserve">Working assumption (explicit, presentation-only — per Manas, 7/24):</w:t>
+      </w:r>
+      <w:r>
+        <w:t xml:space="preserve"> </w:t>
+      </w:r>
+      <w:r>
+        <w:t xml:space="preserve">this dataset identifies pricing</w:t>
+      </w:r>
+      <w:r>
+        <w:t xml:space="preserve"> </w:t>
+      </w:r>
+      <w:r>
+        <w:rPr>
+          <w:i/>
+          <w:iCs/>
+        </w:rPr>
+        <w:t xml:space="preserve">opportunity</w:t>
+      </w:r>
+      <w:r>
+        <w:t xml:space="preserve">, not causal revenue uplift. In reality, Airbnb would validate these recommendations against its own proprietary booking-conversion and price-elasticity data before deployment — data this team’s dataset doesn’t contain. For presentation purposes, we stand in for that with a simplifying assumption: moving an underpriced listing to fair value is treated as roughly occupancy-neutral, since fair value is itself calibrated to what comparable listings already charge and get booked at.</w:t>
       </w:r>
     </w:p>
     <w:p>
@@ -1249,6 +1274,24 @@
       </w:r>
       <w:r>
         <w:t xml:space="preserve">claims, and it’s the number the Commander’s Intent narrative argues the team can move.</w:t>
+      </w:r>
+    </w:p>
+    <w:p>
+      <w:pPr>
+        <w:pStyle w:val="BodyText"/>
+      </w:pPr>
+      <w:r>
+        <w:rPr>
+          <w:b/>
+          <w:bCs/>
+        </w:rPr>
+        <w:t xml:space="preserve">In progress (Jai, as of 7/25):</w:t>
+      </w:r>
+      <w:r>
+        <w:t xml:space="preserve"> </w:t>
+      </w:r>
+      <w:r>
+        <w:t xml:space="preserve">tightening the financials generally (likely includes the NPV/discounting and marginal-cost points flagged above) plus a few additional model robustness tweaks. Jai’s own framing: these aren’t expected to materially change the headline numbers, just make the underlying model more defensible under scrutiny. Numbers in this section may move slightly once that lands — not a signal to redo Sections 3-6 from scratch, just to re-check them against whatever Jai pushes.</w:t>
       </w:r>
     </w:p>
     <w:p>
@@ -2410,6 +2453,68 @@
       </w:r>
     </w:p>
     <w:p>
+      <w:pPr>
+        <w:pStyle w:val="BodyText"/>
+      </w:pPr>
+      <w:r>
+        <w:rPr>
+          <w:b/>
+          <w:bCs/>
+        </w:rPr>
+        <w:t xml:space="preserve">Flagged by Jai (7/24), not yet actioned — Jai to own:</w:t>
+      </w:r>
+      <w:r>
+        <w:t xml:space="preserve"> </w:t>
+      </w:r>
+      <w:r>
+        <w:t xml:space="preserve">the $190K/$105K figures above are</w:t>
+      </w:r>
+      <w:r>
+        <w:t xml:space="preserve"> </w:t>
+      </w:r>
+      <w:r>
+        <w:t xml:space="preserve">“cost if built standalone.”</w:t>
+      </w:r>
+      <w:r>
+        <w:t xml:space="preserve"> </w:t>
+      </w:r>
+      <w:r>
+        <w:t xml:space="preserve">Airbnb almost certainly already has model-serving infra, A/B testing pipelines, and pricing-feature engineering in place, so the real</w:t>
+      </w:r>
+      <w:r>
+        <w:t xml:space="preserve"> </w:t>
+      </w:r>
+      <w:r>
+        <w:rPr>
+          <w:i/>
+          <w:iCs/>
+        </w:rPr>
+        <w:t xml:space="preserve">incremental</w:t>
+      </w:r>
+      <w:r>
+        <w:t xml:space="preserve"> </w:t>
+      </w:r>
+      <w:r>
+        <w:t xml:space="preserve">cost of adding this feature is likely closer to</w:t>
+      </w:r>
+      <w:r>
+        <w:t xml:space="preserve"> </w:t>
+      </w:r>
+      <w:r>
+        <w:rPr>
+          <w:b/>
+          <w:bCs/>
+        </w:rPr>
+        <w:t xml:space="preserve">$50-80K in engineering time</w:t>
+      </w:r>
+      <w:r>
+        <w:t xml:space="preserve"> </w:t>
+      </w:r>
+      <w:r>
+        <w:t xml:space="preserve">(Jai’s estimate, not externally sourced). Using the standalone figure overstates cost and therefore understates ROI. If this gets incorporated, it should run as a second scenario alongside the $190K greenfield build, not a replacement, since the greenfield number has real sourced benchmarks behind it — and Sections 5 and 6’s ROI/payback tables would need a second column to match.</w:t>
+      </w:r>
+    </w:p>
+    <w:p>
       <w:r>
         <w:pict>
           <v:rect style="width:0;height:1.5pt" o:hralign="center" o:hrstd="t" o:hr="t"/>
@@ -2924,6 +3029,36 @@
       </w:r>
     </w:p>
     <w:p>
+      <w:pPr>
+        <w:pStyle w:val="BodyText"/>
+      </w:pPr>
+      <w:r>
+        <w:rPr>
+          <w:b/>
+          <w:bCs/>
+        </w:rPr>
+        <w:t xml:space="preserve">Flagged by Jai (7/24), not yet actioned — Jai to own:</w:t>
+      </w:r>
+      <w:r>
+        <w:t xml:space="preserve"> </w:t>
+      </w:r>
+      <w:r>
+        <w:t xml:space="preserve">the</w:t>
+      </w:r>
+      <w:r>
+        <w:t xml:space="preserve"> </w:t>
+      </w:r>
+      <w:r>
+        <w:t xml:space="preserve">“5-yr net revenue”</w:t>
+      </w:r>
+      <w:r>
+        <w:t xml:space="preserve"> </w:t>
+      </w:r>
+      <w:r>
+        <w:t xml:space="preserve">figures above are nominal sums, a dollar in Year 5 is treated the same as a dollar today. That’s inconsistent with naming NPV as the methodology at the top of this section without actually discounting anything. Jai’s read: a proper NPV at a modest 10% discount rate would reduce these numbers somewhat, not enough to hurt the story, but worth doing for a technically rigorous audience (and for internal consistency with Section 4’s cited methodology). Applies to Section 6’s year-by-year cash flows too, same issue there.</w:t>
+      </w:r>
+    </w:p>
+    <w:p>
       <w:r>
         <w:pict>
           <v:rect style="width:0;height:1.5pt" o:hralign="center" o:hrstd="t" o:hr="t"/>
@@ -4659,7 +4794,17 @@
         <w:t xml:space="preserve"> </w:t>
       </w:r>
       <w:r>
-        <w:t xml:space="preserve">- Build the actual slide content for each row — this document only outlines what goes where, none of it is drafted yet. Slide 3 and Slide 8 especially need real editorial discipline given how much each is carrying</w:t>
+        <w:t xml:space="preserve">- Build the actual slide content for each row — this document only outlines what goes where, none of it is drafted yet. Slide 3 and Slide 8 especially need real editorial discipline given how much each is carrying.</w:t>
+      </w:r>
+      <w:r>
+        <w:t xml:space="preserve"> </w:t>
+      </w:r>
+      <w:r>
+        <w:rPr>
+          <w:b/>
+          <w:bCs/>
+        </w:rPr>
+        <w:t xml:space="preserve">Owner: Manas (lead), with Francois and Rachael on slide construction and visualizations.</w:t>
       </w:r>
       <w:r>
         <w:t xml:space="preserve"> </w:t>
@@ -4687,7 +4832,45 @@
         <w:t xml:space="preserve"> </w:t>
       </w:r>
       <w:r>
-        <w:t xml:space="preserve">(not part of the 13 timed slides) — pull from Sections 3-6’s full backup tables/methodology detail</w:t>
+        <w:t xml:space="preserve">(not part of the 13 timed slides) — pull from Sections 3-6’s full backup tables/methodology detail.</w:t>
+      </w:r>
+      <w:r>
+        <w:t xml:space="preserve"> </w:t>
+      </w:r>
+      <w:r>
+        <w:rPr>
+          <w:b/>
+          <w:bCs/>
+        </w:rPr>
+        <w:t xml:space="preserve">Owner: Brendan</w:t>
+      </w:r>
+      <w:r>
+        <w:t xml:space="preserve"> </w:t>
+      </w:r>
+      <w:r>
+        <w:t xml:space="preserve">(assembling appendices and the long-form work behind the model and presentation generally).</w:t>
+      </w:r>
+      <w:r>
+        <w:t xml:space="preserve"> </w:t>
+      </w:r>
+      <w:r>
+        <w:t xml:space="preserve">-</w:t>
+      </w:r>
+      <w:r>
+        <w:t xml:space="preserve"> </w:t>
+      </w:r>
+      <w:r>
+        <w:rPr>
+          <w:b/>
+          <w:bCs/>
+        </w:rPr>
+        <w:t xml:space="preserve">UI/slide branding &amp; design pass — unassigned, TBD.</w:t>
+      </w:r>
+      <w:r>
+        <w:t xml:space="preserve"> </w:t>
+      </w:r>
+      <w:r>
+        <w:t xml:space="preserve">Since the pitch is framed as an internal Airbnb team, the UI and the slide deck should probably share a consistent, generically Airbnb-styled look rather than looking like two unrelated projects. Nobody owns this yet.</w:t>
       </w:r>
     </w:p>
     <w:p>
@@ -4716,13 +4899,13 @@
           <w:b/>
           <w:bCs/>
         </w:rPr>
-        <w:t xml:space="preserve">Not started.</w:t>
-      </w:r>
-      <w:r>
-        <w:t xml:space="preserve"> </w:t>
-      </w:r>
-      <w:r>
-        <w:t xml:space="preserve">One confirmed piece: the Commander’s Intent framing (Section 2) is meant for spoken delivery only during Slide 7 (Solution Statement), not slide text. Full script should wait until Section 7’s slide content is actually drafted, not just outlined.</w:t>
+        <w:t xml:space="preserve">Owner: Manas (lead), with Francois and Rachael supporting.</w:t>
+      </w:r>
+      <w:r>
+        <w:t xml:space="preserve"> </w:t>
+      </w:r>
+      <w:r>
+        <w:t xml:space="preserve">Team principle, decided 7/24-25: the message the team delivers matters more than the slides themselves — slides exist to support the message, not the other way around. Sections 1-6 of this document (problem/solution framing, the real numbers) are the substantive backbone the script should draw from; Section 7’s slide outline exists to make sure the course’s required content and the faculty’s advice are actually covered, not to dictate the narrative. One confirmed script beat: the Commander’s Intent framing (Section 2) is meant for spoken delivery only during Slide 7 (Solution Statement), not slide text.</w:t>
       </w:r>
     </w:p>
     <w:p>
@@ -4809,7 +4992,245 @@
       </w:r>
     </w:p>
     <w:bookmarkEnd w:id="21"/>
-    <w:bookmarkStart w:id="22" w:name="reminders-for-whoever-picks-this-up"/>
+    <w:bookmarkStart w:id="22" w:name="team-assignments-decided-2026-07-2425"/>
+    <w:p>
+      <w:pPr>
+        <w:pStyle w:val="Heading2"/>
+      </w:pPr>
+      <w:r>
+        <w:t xml:space="preserve">10. Team Assignments (decided 2026-07-24/25)</w:t>
+      </w:r>
+    </w:p>
+    <w:tbl>
+      <w:tblPr>
+        <w:tblStyle w:val="Table"/>
+        <w:tblW w:type="pct" w:w="5000"/>
+        <w:tblLayout w:type="fixed"/>
+        <w:tblLook w:firstRow="1" w:lastRow="0" w:firstColumn="0" w:lastColumn="0" w:noHBand="0" w:noVBand="0" w:val="0020"/>
+      </w:tblPr>
+      <w:tblGrid>
+        <w:gridCol w:w="3960"/>
+        <w:gridCol w:w="3960"/>
+      </w:tblGrid>
+      <w:tr>
+        <w:trPr>
+          <w:tblHeader w:val="on"/>
+        </w:trPr>
+        <w:tc>
+          <w:tcPr/>
+          <w:p>
+            <w:pPr>
+              <w:pStyle w:val="Compact"/>
+            </w:pPr>
+            <w:r>
+              <w:t xml:space="preserve">Owner</w:t>
+            </w:r>
+          </w:p>
+        </w:tc>
+        <w:tc>
+          <w:tcPr/>
+          <w:p>
+            <w:pPr>
+              <w:pStyle w:val="Compact"/>
+            </w:pPr>
+            <w:r>
+              <w:t xml:space="preserve">Scope</w:t>
+            </w:r>
+          </w:p>
+        </w:tc>
+      </w:tr>
+      <w:tr>
+        <w:tc>
+          <w:tcPr/>
+          <w:p>
+            <w:pPr>
+              <w:pStyle w:val="Compact"/>
+            </w:pPr>
+            <w:r>
+              <w:rPr>
+                <w:b/>
+                <w:bCs/>
+              </w:rPr>
+              <w:t xml:space="preserve">Manas</w:t>
+            </w:r>
+            <w:r>
+              <w:t xml:space="preserve"> </w:t>
+            </w:r>
+            <w:r>
+              <w:t xml:space="preserve">(lead)</w:t>
+            </w:r>
+          </w:p>
+        </w:tc>
+        <w:tc>
+          <w:tcPr/>
+          <w:p>
+            <w:pPr>
+              <w:pStyle w:val="Compact"/>
+            </w:pPr>
+            <w:r>
+              <w:t xml:space="preserve">Script writing — the message the team delivers, not just the slides. Supported by Francois and Rachael on the script itself and on slide construction/visualizations.</w:t>
+            </w:r>
+          </w:p>
+        </w:tc>
+      </w:tr>
+      <w:tr>
+        <w:tc>
+          <w:tcPr/>
+          <w:p>
+            <w:pPr>
+              <w:pStyle w:val="Compact"/>
+            </w:pPr>
+            <w:r>
+              <w:rPr>
+                <w:b/>
+                <w:bCs/>
+              </w:rPr>
+              <w:t xml:space="preserve">Francois &amp; Rachael</w:t>
+            </w:r>
+          </w:p>
+        </w:tc>
+        <w:tc>
+          <w:tcPr/>
+          <w:p>
+            <w:pPr>
+              <w:pStyle w:val="Compact"/>
+            </w:pPr>
+            <w:r>
+              <w:t xml:space="preserve">Support Manas on script + slide construction, including visualizations.</w:t>
+            </w:r>
+          </w:p>
+        </w:tc>
+      </w:tr>
+      <w:tr>
+        <w:tc>
+          <w:tcPr/>
+          <w:p>
+            <w:pPr>
+              <w:pStyle w:val="Compact"/>
+            </w:pPr>
+            <w:r>
+              <w:rPr>
+                <w:b/>
+                <w:bCs/>
+              </w:rPr>
+              <w:t xml:space="preserve">Jai</w:t>
+            </w:r>
+          </w:p>
+        </w:tc>
+        <w:tc>
+          <w:tcPr/>
+          <w:p>
+            <w:pPr>
+              <w:pStyle w:val="Compact"/>
+            </w:pPr>
+            <w:r>
+              <w:t xml:space="preserve">Tightening the financials (includes the NPV/discounting and marginal-cost points flagged in Sections 4-5) plus additional model robustness checks — not expected to materially change headline numbers, but may shift them slightly.</w:t>
+            </w:r>
+          </w:p>
+        </w:tc>
+      </w:tr>
+      <w:tr>
+        <w:tc>
+          <w:tcPr/>
+          <w:p>
+            <w:pPr>
+              <w:pStyle w:val="Compact"/>
+            </w:pPr>
+            <w:r>
+              <w:rPr>
+                <w:b/>
+                <w:bCs/>
+              </w:rPr>
+              <w:t xml:space="preserve">Brendan</w:t>
+            </w:r>
+          </w:p>
+        </w:tc>
+        <w:tc>
+          <w:tcPr/>
+          <w:p>
+            <w:pPr>
+              <w:pStyle w:val="Compact"/>
+            </w:pPr>
+            <w:r>
+              <w:t xml:space="preserve">Assembling the appendices and the long-form work behind the model and presentation.</w:t>
+            </w:r>
+          </w:p>
+        </w:tc>
+      </w:tr>
+      <w:tr>
+        <w:tc>
+          <w:tcPr/>
+          <w:p>
+            <w:pPr>
+              <w:pStyle w:val="Compact"/>
+            </w:pPr>
+            <w:r>
+              <w:rPr>
+                <w:b/>
+                <w:bCs/>
+              </w:rPr>
+              <w:t xml:space="preserve">Unassigned, TBD</w:t>
+            </w:r>
+          </w:p>
+        </w:tc>
+        <w:tc>
+          <w:tcPr/>
+          <w:p>
+            <w:pPr>
+              <w:pStyle w:val="Compact"/>
+            </w:pPr>
+            <w:r>
+              <w:t xml:space="preserve">UI/slide branding &amp; design pass — generically Airbnb-styled look, kept consistent between the slide deck and the dashboard UI. Nobody owns this yet.</w:t>
+            </w:r>
+          </w:p>
+        </w:tc>
+      </w:tr>
+    </w:tbl>
+    <w:p>
+      <w:pPr>
+        <w:pStyle w:val="BodyText"/>
+      </w:pPr>
+      <w:r>
+        <w:rPr>
+          <w:b/>
+          <w:bCs/>
+        </w:rPr>
+        <w:t xml:space="preserve">Guiding principle:</w:t>
+      </w:r>
+      <w:r>
+        <w:t xml:space="preserve"> </w:t>
+      </w:r>
+      <w:r>
+        <w:t xml:space="preserve">the message matters more than the slides. Slides support the message; the framework in Sections 0-7 exists to make sure the course’s required content and the faculty’s advice are actually covered, not to dictate the narrative.</w:t>
+      </w:r>
+    </w:p>
+    <w:p>
+      <w:pPr>
+        <w:pStyle w:val="BodyText"/>
+      </w:pPr>
+      <w:r>
+        <w:rPr>
+          <w:b/>
+          <w:bCs/>
+        </w:rPr>
+        <w:t xml:space="preserve">Saturday team meeting objective:</w:t>
+      </w:r>
+      <w:r>
+        <w:t xml:space="preserve"> </w:t>
+      </w:r>
+      <w:r>
+        <w:t xml:space="preserve">kick off the work assigned above and leave room for questions/clarifications — not a checkpoint where finished work is expected yet.</w:t>
+      </w:r>
+    </w:p>
+    <w:p>
+      <w:r>
+        <w:pict>
+          <v:rect style="width:0;height:1.5pt" o:hralign="center" o:hrstd="t" o:hr="t"/>
+        </w:pict>
+      </w:r>
+    </w:p>
+    <w:bookmarkEnd w:id="22"/>
+    <w:bookmarkStart w:id="23" w:name="reminders-for-whoever-picks-this-up"/>
     <w:p>
       <w:pPr>
         <w:pStyle w:val="Heading2"/>
@@ -4945,8 +5366,30 @@
         <w:t xml:space="preserve">.</w:t>
       </w:r>
     </w:p>
-    <w:bookmarkEnd w:id="22"/>
+    <w:p>
+      <w:pPr>
+        <w:pStyle w:val="Compact"/>
+        <w:numPr>
+          <w:ilvl w:val="0"/>
+          <w:numId w:val="1016"/>
+        </w:numPr>
+      </w:pPr>
+      <w:r>
+        <w:rPr>
+          <w:b/>
+          <w:bCs/>
+        </w:rPr>
+        <w:t xml:space="preserve">Ownership:</w:t>
+      </w:r>
+      <w:r>
+        <w:t xml:space="preserve"> </w:t>
+      </w:r>
+      <w:r>
+        <w:t xml:space="preserve">see Section 10 above for who’s doing what as of 7/25.</w:t>
+      </w:r>
+    </w:p>
     <w:bookmarkEnd w:id="23"/>
+    <w:bookmarkEnd w:id="24"/>
     <w:sectPr>
       <w:footnotePr>
         <w:numRestart w:val="eachSect"/>

</xml_diff>

<commit_message>
Correct faculty email date, add Q&A-timing open question, repo/agenda updates
Faculty guidance email was received 7/24, not 7/26 as originally
logged - fixed everywhere that date appeared. Submission logistics
corrected: the repo link has already been shared with our primary
faculty advisor (Jamie), only CA confirmation is still open, not
the whole step.

Flags a real open question in Section 0: the 25 +/- minute limit's
relationship to Q&A is unconfirmed by faculty, and the current
13-slide/~20-min plan in Section 7 assumes presentation-only time.
That assumption needs validation, not silent adoption - added to
Saturday's agenda alongside finalizing the Thursday 11:30am meeting
with Jamie.

Expands Jai's Section 10 scope to include cleaning up and organizing
the repo itself so it presents professionally to graders, on top of
the financial-tightening work already assigned to him.

Co-Authored-By: Claude Sonnet 5 <noreply@anthropic.com>
</commit_message>
<xml_diff>
--- a/Presentation Planning Notes.docx
+++ b/Presentation Planning Notes.docx
@@ -31,7 +31,7 @@
         <w:t xml:space="preserve"> </w:t>
       </w:r>
       <w:r>
-        <w:t xml:space="preserve">— external, not in this repo), this planning thread, and the faculty guidance email received 7/26 (Jamie, Vidur, Rob). Nothing here is final; each section needs team sign-off before it’s locked.</w:t>
+        <w:t xml:space="preserve">— external, not in this repo), this planning thread, and the faculty guidance email received 7/24 (Jamie, Vidur, Rob). Nothing here is final; each section needs team sign-off before it’s locked.</w:t>
       </w:r>
       <w:r>
         <w:t xml:space="preserve"> </w:t>
@@ -71,7 +71,7 @@
         <w:pStyle w:val="FirstParagraph"/>
       </w:pPr>
       <w:r>
-        <w:t xml:space="preserve">An email from the faculty (7/26) makes clear the actual presentation context is different from what Sections 1-7 below were originally built for.</w:t>
+        <w:t xml:space="preserve">An email from the faculty (7/24) makes clear the actual presentation context is different from what Sections 1-7 below were originally built for.</w:t>
       </w:r>
       <w:r>
         <w:t xml:space="preserve"> </w:t>
@@ -157,19 +157,29 @@
           <w:b/>
           <w:bCs/>
         </w:rPr>
-        <w:t xml:space="preserve">The demo should be pre-recorded and narrated, not live.</w:t>
-      </w:r>
-      <w:r>
-        <w:t xml:space="preserve"> </w:t>
-      </w:r>
-      <w:r>
-        <w:t xml:space="preserve">Faculty explicitly warn:</w:t>
-      </w:r>
-      <w:r>
-        <w:t xml:space="preserve"> </w:t>
-      </w:r>
-      <w:r>
-        <w:t xml:space="preserve">“Murphy’s law prevails… if something will go wrong it will.”</w:t>
+        <w:t xml:space="preserve">⚠️ OPEN QUESTION, awaiting faculty response:</w:t>
+      </w:r>
+      <w:r>
+        <w:t xml:space="preserve"> </w:t>
+      </w:r>
+      <w:r>
+        <w:t xml:space="preserve">is the 25 ± minutes inclusive of Q&amp;A, or presentation-only with Q&amp;A separate? This is not a minor detail — it changes the deck strategy materially. If Q&amp;A is included in the 25, the actual talking portion needs to be much shorter (something like a 10-15 min presentation + 10-15 min Q&amp;A) than if the full 25 is presentation time with Q&amp;A afterward.</w:t>
+      </w:r>
+      <w:r>
+        <w:t xml:space="preserve"> </w:t>
+      </w:r>
+      <w:r>
+        <w:rPr>
+          <w:b/>
+          <w:bCs/>
+        </w:rPr>
+        <w:t xml:space="preserve">Everything in Section 7 below is built on the assumption that the 25 (planned to ~20) is presentation-only</w:t>
+      </w:r>
+      <w:r>
+        <w:t xml:space="preserve"> </w:t>
+      </w:r>
+      <w:r>
+        <w:t xml:space="preserve">— that assumption needs to be confirmed, not treated as settled. This is on the agenda for the Thursday 11:30am meeting with Jamie (see Section 10).</w:t>
       </w:r>
     </w:p>
     <w:p>
@@ -185,13 +195,19 @@
           <w:b/>
           <w:bCs/>
         </w:rPr>
-        <w:t xml:space="preserve">There’s a formal grading rubric</w:t>
-      </w:r>
-      <w:r>
-        <w:t xml:space="preserve"> </w:t>
-      </w:r>
-      <w:r>
-        <w:t xml:space="preserve">(below) with required content items that weren’t all in the original plan — most notably 2-4 slides on key variables/relationships (EDA), which didn’t exist before at all.</w:t>
+        <w:t xml:space="preserve">The demo should be pre-recorded and narrated, not live.</w:t>
+      </w:r>
+      <w:r>
+        <w:t xml:space="preserve"> </w:t>
+      </w:r>
+      <w:r>
+        <w:t xml:space="preserve">Faculty explicitly warn:</w:t>
+      </w:r>
+      <w:r>
+        <w:t xml:space="preserve"> </w:t>
+      </w:r>
+      <w:r>
+        <w:t xml:space="preserve">“Murphy’s law prevails… if something will go wrong it will.”</w:t>
       </w:r>
     </w:p>
     <w:p>
@@ -207,23 +223,51 @@
           <w:b/>
           <w:bCs/>
         </w:rPr>
+        <w:t xml:space="preserve">There’s a formal grading rubric</w:t>
+      </w:r>
+      <w:r>
+        <w:t xml:space="preserve"> </w:t>
+      </w:r>
+      <w:r>
+        <w:t xml:space="preserve">(below) with required content items that weren’t all in the original plan — most notably 2-4 slides on key variables/relationships (EDA), which didn’t exist before at all.</w:t>
+      </w:r>
+    </w:p>
+    <w:p>
+      <w:pPr>
+        <w:pStyle w:val="Compact"/>
+        <w:numPr>
+          <w:ilvl w:val="0"/>
+          <w:numId w:val="1001"/>
+        </w:numPr>
+      </w:pPr>
+      <w:r>
+        <w:rPr>
+          <w:b/>
+          <w:bCs/>
+        </w:rPr>
         <w:t xml:space="preserve">Submission has two parts:</w:t>
       </w:r>
       <w:r>
         <w:t xml:space="preserve"> </w:t>
       </w:r>
       <w:r>
-        <w:t xml:space="preserve">the slide deck (PPT or PDF) goes to Canvas; a link to this GitHub repo (with model outputs/interim work) needs to go to the faculty member and CA separately, by email or Canvas comment.</w:t>
-      </w:r>
-      <w:r>
-        <w:t xml:space="preserve"> </w:t>
-      </w:r>
-      <w:r>
-        <w:rPr>
-          <w:b/>
-          <w:bCs/>
-        </w:rPr>
-        <w:t xml:space="preserve">This hasn’t been done yet — someone needs to send that email.</w:t>
+        <w:t xml:space="preserve">the slide deck (PPT or PDF) goes to Canvas; a link to this GitHub repo (with model outputs/interim work) goes to the faculty member and CA separately, by email or Canvas comment.</w:t>
+      </w:r>
+      <w:r>
+        <w:t xml:space="preserve"> </w:t>
+      </w:r>
+      <w:r>
+        <w:rPr>
+          <w:b/>
+          <w:bCs/>
+        </w:rPr>
+        <w:t xml:space="preserve">The repo link has already been shared with our primary faculty advisor (Jamie).</w:t>
+      </w:r>
+      <w:r>
+        <w:t xml:space="preserve"> </w:t>
+      </w:r>
+      <w:r>
+        <w:t xml:space="preserve">Unconfirmed whether the CA has it too — worth double-checking before treating this as fully done.</w:t>
       </w:r>
     </w:p>
     <w:bookmarkStart w:id="9" w:name="Xe17144e15cb8d1305b87ebea97fb76157ea8c5b"/>
@@ -3802,13 +3846,13 @@
       </w:r>
     </w:p>
     <w:bookmarkEnd w:id="18"/>
-    <w:bookmarkStart w:id="19" w:name="X5d595102b63777b84b07f035f5d6d228d9ef0e4"/>
+    <w:bookmarkStart w:id="19" w:name="Xec6859dcc962051cd6c77fd6d903fe3c26f8d0b"/>
     <w:p>
       <w:pPr>
         <w:pStyle w:val="Heading2"/>
       </w:pPr>
       <w:r>
-        <w:t xml:space="preserve">7. Slide Sequence (~25-minute presentation) — REBUILT 2026-07-26 for the real time limit and rubric</w:t>
+        <w:t xml:space="preserve">7. Slide Sequence (~25-minute presentation) — REBUILT following the 7/24 faculty guidance for the real time limit and rubric</w:t>
       </w:r>
     </w:p>
     <w:p>
@@ -4981,7 +5025,29 @@
           <w:b/>
           <w:bCs/>
         </w:rPr>
-        <w:t xml:space="preserve">This has not been done yet as of this note (2026-07-26) — someone needs to own sending it.</w:t>
+        <w:t xml:space="preserve">Already shared with our primary faculty advisor (Jamie).</w:t>
+      </w:r>
+      <w:r>
+        <w:t xml:space="preserve"> </w:t>
+      </w:r>
+      <w:r>
+        <w:t xml:space="preserve">Unconfirmed whether the CA has it too — someone should double-check/send separately if not.</w:t>
+      </w:r>
+      <w:r>
+        <w:t xml:space="preserve"> </w:t>
+      </w:r>
+      <w:r>
+        <w:rPr>
+          <w:b/>
+          <w:bCs/>
+        </w:rPr>
+        <w:t xml:space="preserve">Also now Jai’s responsibility to clean up and organize the repo itself</w:t>
+      </w:r>
+      <w:r>
+        <w:t xml:space="preserve"> </w:t>
+      </w:r>
+      <w:r>
+        <w:t xml:space="preserve">(see Section 10) — right now it’s a working directory, not something built for a grader to navigate cleanly.</w:t>
       </w:r>
     </w:p>
     <w:p>
@@ -5126,6 +5192,22 @@
             <w:r>
               <w:t xml:space="preserve">Tightening the financials (includes the NPV/discounting and marginal-cost points flagged in Sections 4-5) plus additional model robustness checks — not expected to materially change headline numbers, but may shift them slightly.</w:t>
             </w:r>
+            <w:r>
+              <w:t xml:space="preserve"> </w:t>
+            </w:r>
+            <w:r>
+              <w:rPr>
+                <w:b/>
+                <w:bCs/>
+              </w:rPr>
+              <w:t xml:space="preserve">Also: clean up and organize the GitHub repo</w:t>
+            </w:r>
+            <w:r>
+              <w:t xml:space="preserve"> </w:t>
+            </w:r>
+            <w:r>
+              <w:t xml:space="preserve">so graders don’t get lost in it — right now it reads as a working directory, and it needs to present as professional and well-organized given it’s already been shared with our faculty advisor.</w:t>
+            </w:r>
           </w:p>
         </w:tc>
       </w:tr>
@@ -5213,13 +5295,35 @@
           <w:b/>
           <w:bCs/>
         </w:rPr>
-        <w:t xml:space="preserve">Saturday team meeting objective:</w:t>
-      </w:r>
-      <w:r>
-        <w:t xml:space="preserve"> </w:t>
-      </w:r>
-      <w:r>
-        <w:t xml:space="preserve">kick off the work assigned above and leave room for questions/clarifications — not a checkpoint where finished work is expected yet.</w:t>
+        <w:t xml:space="preserve">Saturday team meeting agenda:</w:t>
+      </w:r>
+      <w:r>
+        <w:t xml:space="preserve"> </w:t>
+      </w:r>
+      <w:r>
+        <w:t xml:space="preserve">1. Kick off the work assigned above and leave room for questions/clarifications — not a checkpoint where finished work is expected yet.</w:t>
+      </w:r>
+      <w:r>
+        <w:t xml:space="preserve"> </w:t>
+      </w:r>
+      <w:r>
+        <w:t xml:space="preserve">2.</w:t>
+      </w:r>
+      <w:r>
+        <w:t xml:space="preserve"> </w:t>
+      </w:r>
+      <w:r>
+        <w:rPr>
+          <w:b/>
+          <w:bCs/>
+        </w:rPr>
+        <w:t xml:space="preserve">Finalize the Thursday 11:30am meeting with Jamie</w:t>
+      </w:r>
+      <w:r>
+        <w:t xml:space="preserve"> </w:t>
+      </w:r>
+      <w:r>
+        <w:t xml:space="preserve">(our faculty advisor). This is also the natural moment to get a direct answer on the open Q&amp;A-timing question flagged in Section 0 — worth putting on the agenda for that meeting specifically if it isn’t answered by email first.</w:t>
       </w:r>
     </w:p>
     <w:p>

</xml_diff>

<commit_message>
Add Section 11 meeting schedule, expand Saturday agenda
Adds full Sat-Fri deliverable schedule with residency-week note, and
adds UI branding owner, Jamie email, and repo-collaborator agenda
items to Saturday's kickoff.

Co-Authored-By: Claude Sonnet 5 <noreply@anthropic.com>
</commit_message>
<xml_diff>
--- a/Presentation Planning Notes.docx
+++ b/Presentation Planning Notes.docx
@@ -2,7 +2,7 @@
 <file path=word/document.xml><?xml version="1.0" encoding="utf-8"?>
 <w:document xmlns:w="http://schemas.openxmlformats.org/wordprocessingml/2006/main" xmlns:m="http://schemas.openxmlformats.org/officeDocument/2006/math" xmlns:r="http://schemas.openxmlformats.org/officeDocument/2006/relationships" xmlns:o="urn:schemas-microsoft-com:office:office" xmlns:v="urn:schemas-microsoft-com:vml" xmlns:w10="urn:schemas-microsoft-com:office:word" xmlns:a="http://schemas.openxmlformats.org/drawingml/2006/main" xmlns:pic="http://schemas.openxmlformats.org/drawingml/2006/picture" xmlns:wp="http://schemas.openxmlformats.org/drawingml/2006/wordprocessingDrawing">
   <w:body>
-    <w:bookmarkStart w:id="24" w:name="presentation-planning-notes"/>
+    <w:bookmarkStart w:id="25" w:name="presentation-planning-notes"/>
     <w:p>
       <w:pPr>
         <w:pStyle w:val="Heading1"/>
@@ -157,7 +157,7 @@
           <w:b/>
           <w:bCs/>
         </w:rPr>
-        <w:t xml:space="preserve">⚠️ OPEN QUESTION, awaiting faculty response:</w:t>
+        <w:t xml:space="preserve">⚠️ OPEN QUESTION, needs an answer NLT Monday 7/27:</w:t>
       </w:r>
       <w:r>
         <w:t xml:space="preserve"> </w:t>
@@ -179,7 +179,23 @@
         <w:t xml:space="preserve"> </w:t>
       </w:r>
       <w:r>
-        <w:t xml:space="preserve">— that assumption needs to be confirmed, not treated as settled. This is on the agenda for the Thursday 11:30am meeting with Jamie (see Section 10).</w:t>
+        <w:t xml:space="preserve">— that assumption needs to be confirmed, not treated as settled.</w:t>
+      </w:r>
+      <w:r>
+        <w:t xml:space="preserve"> </w:t>
+      </w:r>
+      <w:r>
+        <w:rPr>
+          <w:b/>
+          <w:bCs/>
+        </w:rPr>
+        <w:t xml:space="preserve">Do not wait for the Thursday 11:30am meeting with Jamie to get this answer</w:t>
+      </w:r>
+      <w:r>
+        <w:t xml:space="preserve"> </w:t>
+      </w:r>
+      <w:r>
+        <w:t xml:space="preserve">— reach out by email this weekend. Script v1 and Deck v1 (due Monday and Tuesday, see Section 11) are being built on the presentation-only assumption; if that assumption is wrong and the answer doesn’t land until later in the week, the team is looking at rebuilding the whole script and deck under real time pressure instead of a course correction.</w:t>
       </w:r>
     </w:p>
     <w:p>
@@ -5323,7 +5339,73 @@
         <w:t xml:space="preserve"> </w:t>
       </w:r>
       <w:r>
-        <w:t xml:space="preserve">(our faculty advisor). This is also the natural moment to get a direct answer on the open Q&amp;A-timing question flagged in Section 0 — worth putting on the agenda for that meeting specifically if it isn’t answered by email first.</w:t>
+        <w:t xml:space="preserve">(our faculty advisor).</w:t>
+      </w:r>
+      <w:r>
+        <w:t xml:space="preserve"> </w:t>
+      </w:r>
+      <w:r>
+        <w:t xml:space="preserve">3.</w:t>
+      </w:r>
+      <w:r>
+        <w:t xml:space="preserve"> </w:t>
+      </w:r>
+      <w:r>
+        <w:rPr>
+          <w:b/>
+          <w:bCs/>
+        </w:rPr>
+        <w:t xml:space="preserve">Assign an owner for UI/slide branding</w:t>
+      </w:r>
+      <w:r>
+        <w:t xml:space="preserve"> </w:t>
+      </w:r>
+      <w:r>
+        <w:t xml:space="preserve">(still TBD as of this note) — it’s now on the critical path for the demo recording (Section 11).</w:t>
+      </w:r>
+      <w:r>
+        <w:t xml:space="preserve"> </w:t>
+      </w:r>
+      <w:r>
+        <w:t xml:space="preserve">4.</w:t>
+      </w:r>
+      <w:r>
+        <w:t xml:space="preserve"> </w:t>
+      </w:r>
+      <w:r>
+        <w:rPr>
+          <w:b/>
+          <w:bCs/>
+        </w:rPr>
+        <w:t xml:space="preserve">Someone emails Jamie this weekend</w:t>
+      </w:r>
+      <w:r>
+        <w:t xml:space="preserve"> </w:t>
+      </w:r>
+      <w:r>
+        <w:t xml:space="preserve">about the Q&amp;A-timing question (Section 0) — do not wait for the Thursday meeting to ask. Need an answer no later than Monday 7/27, since that’s when Script v1 is due and it’s being built on an unconfirmed assumption.</w:t>
+      </w:r>
+      <w:r>
+        <w:t xml:space="preserve"> </w:t>
+      </w:r>
+      <w:r>
+        <w:t xml:space="preserve">5.</w:t>
+      </w:r>
+      <w:r>
+        <w:t xml:space="preserve"> </w:t>
+      </w:r>
+      <w:r>
+        <w:rPr>
+          <w:b/>
+          <w:bCs/>
+        </w:rPr>
+        <w:t xml:space="preserve">Everyone joins the GitHub repo as a collaborator</w:t>
+      </w:r>
+      <w:r>
+        <w:t xml:space="preserve"> </w:t>
+      </w:r>
+      <w:r>
+        <w:t xml:space="preserve">— Manas, Rachael, and Francois currently aren’t on it (only Brendan and Jai show up as collaborators as of 7/25). Jai (repo owner) needs to send invites; each person needs to accept and confirm access before Sunday’s work day starts.</w:t>
       </w:r>
     </w:p>
     <w:p>
@@ -5334,7 +5416,560 @@
       </w:r>
     </w:p>
     <w:bookmarkEnd w:id="22"/>
-    <w:bookmarkStart w:id="23" w:name="reminders-for-whoever-picks-this-up"/>
+    <w:bookmarkStart w:id="23" w:name="Xd200ea8c4922163a8185cb253733ac4614ef7eb"/>
+    <w:p>
+      <w:pPr>
+        <w:pStyle w:val="Heading2"/>
+      </w:pPr>
+      <w:r>
+        <w:t xml:space="preserve">11. Meeting Schedule &amp; Deliverables (decided 2026-07-25)</w:t>
+      </w:r>
+    </w:p>
+    <w:p>
+      <w:pPr>
+        <w:pStyle w:val="FirstParagraph"/>
+      </w:pPr>
+      <w:r>
+        <w:t xml:space="preserve">Daily team meetings Monday-Friday, work starting Saturday. Structure: script and deck reviewed in alternating v1/v2 stages, converging on a v3 FINAL Friday. Each meeting is for discussion and getting agreement where needed, not a first look at the work.</w:t>
+      </w:r>
+    </w:p>
+    <w:tbl>
+      <w:tblPr>
+        <w:tblStyle w:val="Table"/>
+        <w:tblW w:type="pct" w:w="5000"/>
+        <w:tblLayout w:type="fixed"/>
+        <w:tblLook w:firstRow="1" w:lastRow="0" w:firstColumn="0" w:lastColumn="0" w:noHBand="0" w:noVBand="0" w:val="0020"/>
+      </w:tblPr>
+      <w:tblGrid>
+        <w:gridCol w:w="1980"/>
+        <w:gridCol w:w="1980"/>
+        <w:gridCol w:w="1980"/>
+        <w:gridCol w:w="1980"/>
+      </w:tblGrid>
+      <w:tr>
+        <w:trPr>
+          <w:tblHeader w:val="on"/>
+        </w:trPr>
+        <w:tc>
+          <w:tcPr/>
+          <w:p>
+            <w:pPr>
+              <w:pStyle w:val="Compact"/>
+            </w:pPr>
+            <w:r>
+              <w:t xml:space="preserve">Day</w:t>
+            </w:r>
+          </w:p>
+        </w:tc>
+        <w:tc>
+          <w:tcPr/>
+          <w:p>
+            <w:pPr>
+              <w:pStyle w:val="Compact"/>
+            </w:pPr>
+            <w:r>
+              <w:t xml:space="preserve">Meeting</w:t>
+            </w:r>
+          </w:p>
+        </w:tc>
+        <w:tc>
+          <w:tcPr/>
+          <w:p>
+            <w:pPr>
+              <w:pStyle w:val="Compact"/>
+            </w:pPr>
+            <w:r>
+              <w:t xml:space="preserve">Due</w:t>
+            </w:r>
+          </w:p>
+        </w:tc>
+        <w:tc>
+          <w:tcPr/>
+          <w:p>
+            <w:pPr>
+              <w:pStyle w:val="Compact"/>
+            </w:pPr>
+            <w:r>
+              <w:t xml:space="preserve">Notes</w:t>
+            </w:r>
+          </w:p>
+        </w:tc>
+      </w:tr>
+      <w:tr>
+        <w:tc>
+          <w:tcPr/>
+          <w:p>
+            <w:pPr>
+              <w:pStyle w:val="Compact"/>
+            </w:pPr>
+            <w:r>
+              <w:rPr>
+                <w:b/>
+                <w:bCs/>
+              </w:rPr>
+              <w:t xml:space="preserve">Sat 7/25</w:t>
+            </w:r>
+          </w:p>
+        </w:tc>
+        <w:tc>
+          <w:tcPr/>
+          <w:p>
+            <w:pPr>
+              <w:pStyle w:val="Compact"/>
+            </w:pPr>
+            <w:r>
+              <w:t xml:space="preserve">Kickoff (today)</w:t>
+            </w:r>
+          </w:p>
+        </w:tc>
+        <w:tc>
+          <w:tcPr/>
+          <w:p>
+            <w:pPr>
+              <w:pStyle w:val="Compact"/>
+            </w:pPr>
+            <w:r>
+              <w:t xml:space="preserve">—</w:t>
+            </w:r>
+          </w:p>
+        </w:tc>
+        <w:tc>
+          <w:tcPr/>
+          <w:p>
+            <w:pPr>
+              <w:pStyle w:val="Compact"/>
+            </w:pPr>
+            <w:r>
+              <w:t xml:space="preserve">See Section 10’s agenda above. UI branding owner assigned here or ASAP after.</w:t>
+            </w:r>
+          </w:p>
+        </w:tc>
+      </w:tr>
+      <w:tr>
+        <w:tc>
+          <w:tcPr/>
+          <w:p>
+            <w:pPr>
+              <w:pStyle w:val="Compact"/>
+            </w:pPr>
+            <w:r>
+              <w:rPr>
+                <w:b/>
+                <w:bCs/>
+              </w:rPr>
+              <w:t xml:space="preserve">Sun 7/26</w:t>
+            </w:r>
+          </w:p>
+        </w:tc>
+        <w:tc>
+          <w:tcPr/>
+          <w:p>
+            <w:pPr>
+              <w:pStyle w:val="Compact"/>
+            </w:pPr>
+            <w:r>
+              <w:rPr>
+                <w:i/>
+                <w:iCs/>
+              </w:rPr>
+              <w:t xml:space="preserve">(work day, no meeting)</w:t>
+            </w:r>
+          </w:p>
+        </w:tc>
+        <w:tc>
+          <w:tcPr/>
+          <w:p>
+            <w:pPr>
+              <w:pStyle w:val="Compact"/>
+            </w:pPr>
+            <w:r>
+              <w:t xml:space="preserve">—</w:t>
+            </w:r>
+          </w:p>
+        </w:tc>
+        <w:tc>
+          <w:tcPr/>
+          <w:p>
+            <w:pPr>
+              <w:pStyle w:val="Compact"/>
+            </w:pPr>
+            <w:r>
+              <w:t xml:space="preserve">Jai: financial tightening + model robustness, push to land before Monday. UI: final tech pass begins. Manas/Francois/Rachael: start Script v1. Brendan: start appendices.</w:t>
+            </w:r>
+          </w:p>
+        </w:tc>
+      </w:tr>
+      <w:tr>
+        <w:tc>
+          <w:tcPr/>
+          <w:p>
+            <w:pPr>
+              <w:pStyle w:val="Compact"/>
+            </w:pPr>
+            <w:r>
+              <w:rPr>
+                <w:b/>
+                <w:bCs/>
+              </w:rPr>
+              <w:t xml:space="preserve">Mon 7/27</w:t>
+            </w:r>
+          </w:p>
+        </w:tc>
+        <w:tc>
+          <w:tcPr/>
+          <w:p>
+            <w:pPr>
+              <w:pStyle w:val="Compact"/>
+            </w:pPr>
+            <w:r>
+              <w:rPr>
+                <w:b/>
+                <w:bCs/>
+              </w:rPr>
+              <w:t xml:space="preserve">Script v1 Review</w:t>
+            </w:r>
+          </w:p>
+        </w:tc>
+        <w:tc>
+          <w:tcPr/>
+          <w:p>
+            <w:pPr>
+              <w:pStyle w:val="Compact"/>
+            </w:pPr>
+            <w:r>
+              <w:t xml:space="preserve">Script v1</w:t>
+            </w:r>
+          </w:p>
+        </w:tc>
+        <w:tc>
+          <w:tcPr/>
+          <w:p>
+            <w:pPr>
+              <w:pStyle w:val="Compact"/>
+            </w:pPr>
+            <w:r>
+              <w:t xml:space="preserve">Discuss whether the message lands, flag narrative gaps. Status check: Jai’s financials, UI tech pass.</w:t>
+            </w:r>
+            <w:r>
+              <w:t xml:space="preserve"> </w:t>
+            </w:r>
+            <w:r>
+              <w:rPr>
+                <w:b/>
+                <w:bCs/>
+              </w:rPr>
+              <w:t xml:space="preserve">Also: is there an answer from Jamie on the Q&amp;A-timing question yet?</w:t>
+            </w:r>
+            <w:r>
+              <w:t xml:space="preserve"> </w:t>
+            </w:r>
+            <w:r>
+              <w:t xml:space="preserve">If not, this is now the top-priority follow-up — the deadline for that answer is today.</w:t>
+            </w:r>
+          </w:p>
+        </w:tc>
+      </w:tr>
+      <w:tr>
+        <w:tc>
+          <w:tcPr/>
+          <w:p>
+            <w:pPr>
+              <w:pStyle w:val="Compact"/>
+            </w:pPr>
+            <w:r>
+              <w:rPr>
+                <w:b/>
+                <w:bCs/>
+              </w:rPr>
+              <w:t xml:space="preserve">Tue 7/28</w:t>
+            </w:r>
+          </w:p>
+        </w:tc>
+        <w:tc>
+          <w:tcPr/>
+          <w:p>
+            <w:pPr>
+              <w:pStyle w:val="Compact"/>
+            </w:pPr>
+            <w:r>
+              <w:rPr>
+                <w:b/>
+                <w:bCs/>
+              </w:rPr>
+              <w:t xml:space="preserve">Deck v1 Review</w:t>
+            </w:r>
+          </w:p>
+        </w:tc>
+        <w:tc>
+          <w:tcPr/>
+          <w:p>
+            <w:pPr>
+              <w:pStyle w:val="Compact"/>
+            </w:pPr>
+            <w:r>
+              <w:t xml:space="preserve">Deck v1 (13 slides, populated)</w:t>
+            </w:r>
+          </w:p>
+        </w:tc>
+        <w:tc>
+          <w:tcPr/>
+          <w:p>
+            <w:pPr>
+              <w:pStyle w:val="Compact"/>
+            </w:pPr>
+            <w:r>
+              <w:t xml:space="preserve">Discuss whether the deck supports the script, not just covers rubric items. UI branding pass should be underway; target UI approval Tue night/Wed morning.</w:t>
+            </w:r>
+          </w:p>
+        </w:tc>
+      </w:tr>
+      <w:tr>
+        <w:tc>
+          <w:tcPr/>
+          <w:p>
+            <w:pPr>
+              <w:pStyle w:val="Compact"/>
+            </w:pPr>
+            <w:r>
+              <w:rPr>
+                <w:b/>
+                <w:bCs/>
+              </w:rPr>
+              <w:t xml:space="preserve">Wed 7/29</w:t>
+            </w:r>
+          </w:p>
+        </w:tc>
+        <w:tc>
+          <w:tcPr/>
+          <w:p>
+            <w:pPr>
+              <w:pStyle w:val="Compact"/>
+            </w:pPr>
+            <w:r>
+              <w:rPr>
+                <w:b/>
+                <w:bCs/>
+              </w:rPr>
+              <w:t xml:space="preserve">Script v2 Review</w:t>
+            </w:r>
+          </w:p>
+        </w:tc>
+        <w:tc>
+          <w:tcPr/>
+          <w:p>
+            <w:pPr>
+              <w:pStyle w:val="Compact"/>
+            </w:pPr>
+            <w:r>
+              <w:t xml:space="preserve">Script v2 (folds in Jai’s finalized numbers + Meeting 1/2 feedback)</w:t>
+            </w:r>
+          </w:p>
+        </w:tc>
+        <w:tc>
+          <w:tcPr/>
+          <w:p>
+            <w:pPr>
+              <w:pStyle w:val="Compact"/>
+            </w:pPr>
+            <w:r>
+              <w:rPr>
+                <w:b/>
+                <w:bCs/>
+              </w:rPr>
+              <w:t xml:space="preserve">Gate: UI approved final</w:t>
+            </w:r>
+            <w:r>
+              <w:t xml:space="preserve"> </w:t>
+            </w:r>
+            <w:r>
+              <w:t xml:space="preserve">(tech + branding both done) unlocks demo recording.</w:t>
+            </w:r>
+            <w:r>
+              <w:t xml:space="preserve"> </w:t>
+            </w:r>
+            <w:r>
+              <w:rPr>
+                <w:b/>
+                <w:bCs/>
+              </w:rPr>
+              <w:t xml:space="preserve">Demo recording scheduled for Wed</w:t>
+            </w:r>
+            <w:r>
+              <w:t xml:space="preserve">, right after approval.</w:t>
+            </w:r>
+          </w:p>
+        </w:tc>
+      </w:tr>
+      <w:tr>
+        <w:tc>
+          <w:tcPr/>
+          <w:p>
+            <w:pPr>
+              <w:pStyle w:val="Compact"/>
+            </w:pPr>
+            <w:r>
+              <w:rPr>
+                <w:b/>
+                <w:bCs/>
+              </w:rPr>
+              <w:t xml:space="preserve">Thu 7/30</w:t>
+            </w:r>
+          </w:p>
+        </w:tc>
+        <w:tc>
+          <w:tcPr/>
+          <w:p>
+            <w:pPr>
+              <w:pStyle w:val="Compact"/>
+            </w:pPr>
+            <w:r>
+              <w:rPr>
+                <w:b/>
+                <w:bCs/>
+              </w:rPr>
+              <w:t xml:space="preserve">Deck v2 Review</w:t>
+            </w:r>
+          </w:p>
+        </w:tc>
+        <w:tc>
+          <w:tcPr/>
+          <w:p>
+            <w:pPr>
+              <w:pStyle w:val="Compact"/>
+            </w:pPr>
+            <w:r>
+              <w:t xml:space="preserve">Deck v2 (demo embedded, finalized financials, near-final repo cleanup)</w:t>
+            </w:r>
+          </w:p>
+        </w:tc>
+        <w:tc>
+          <w:tcPr/>
+          <w:p>
+            <w:pPr>
+              <w:pStyle w:val="Compact"/>
+            </w:pPr>
+            <w:r>
+              <w:rPr>
+                <w:b/>
+                <w:bCs/>
+              </w:rPr>
+              <w:t xml:space="preserve">Due EOD Thursday, firm: Brendan’s appendices, fully complete</w:t>
+            </w:r>
+            <w:r>
+              <w:t xml:space="preserve"> </w:t>
+            </w:r>
+            <w:r>
+              <w:t xml:space="preserve">— not just close, so the team has them in hand to review before Friday, not discovering gaps at v3 FINAL. Thursday 11:30am meeting with Jamie happens same day — prep open questions beforehand.</w:t>
+            </w:r>
+          </w:p>
+        </w:tc>
+      </w:tr>
+      <w:tr>
+        <w:tc>
+          <w:tcPr/>
+          <w:p>
+            <w:pPr>
+              <w:pStyle w:val="Compact"/>
+            </w:pPr>
+            <w:r>
+              <w:rPr>
+                <w:b/>
+                <w:bCs/>
+              </w:rPr>
+              <w:t xml:space="preserve">Fri 7/31</w:t>
+            </w:r>
+          </w:p>
+        </w:tc>
+        <w:tc>
+          <w:tcPr/>
+          <w:p>
+            <w:pPr>
+              <w:pStyle w:val="Compact"/>
+            </w:pPr>
+            <w:r>
+              <w:rPr>
+                <w:b/>
+                <w:bCs/>
+              </w:rPr>
+              <w:t xml:space="preserve">v3 FINAL</w:t>
+            </w:r>
+          </w:p>
+        </w:tc>
+        <w:tc>
+          <w:tcPr/>
+          <w:p>
+            <w:pPr>
+              <w:pStyle w:val="Compact"/>
+            </w:pPr>
+            <w:r>
+              <w:t xml:space="preserve">Script v3 (FINAL), Deck v3 (FINAL), demo embedded, appendix (final since Thursday), repo cleaned and organized</w:t>
+            </w:r>
+          </w:p>
+        </w:tc>
+        <w:tc>
+          <w:tcPr/>
+          <w:p>
+            <w:pPr>
+              <w:pStyle w:val="Compact"/>
+            </w:pPr>
+            <w:r>
+              <w:t xml:space="preserve">Matches the team’s existing ~Aug 1 target. This needs to be genuinely final — see residency note below.</w:t>
+            </w:r>
+          </w:p>
+        </w:tc>
+      </w:tr>
+    </w:tbl>
+    <w:p>
+      <w:pPr>
+        <w:pStyle w:val="BodyText"/>
+      </w:pPr>
+      <w:r>
+        <w:rPr>
+          <w:b/>
+          <w:bCs/>
+        </w:rPr>
+        <w:t xml:space="preserve">Residency week (Aug 3-9, NYC) — 3 scheduled work sessions.</w:t>
+      </w:r>
+      <w:r>
+        <w:t xml:space="preserve"> </w:t>
+      </w:r>
+      <w:r>
+        <w:t xml:space="preserve">Goal: all three dedicated to rehearsal, not more building, if it can be avoided. That’s only realistic if Friday’s v3 is actually final, not</w:t>
+      </w:r>
+      <w:r>
+        <w:t xml:space="preserve"> </w:t>
+      </w:r>
+      <w:r>
+        <w:t xml:space="preserve">“final unless something breaks”</w:t>
+      </w:r>
+      <w:r>
+        <w:t xml:space="preserve"> </w:t>
+      </w:r>
+      <w:r>
+        <w:t xml:space="preserve">— worth stating explicitly when the team reviews Friday’s deliverable, since it changes what</w:t>
+      </w:r>
+      <w:r>
+        <w:t xml:space="preserve"> </w:t>
+      </w:r>
+      <w:r>
+        <w:t xml:space="preserve">“done”</w:t>
+      </w:r>
+      <w:r>
+        <w:t xml:space="preserve"> </w:t>
+      </w:r>
+      <w:r>
+        <w:t xml:space="preserve">needs to mean by then.</w:t>
+      </w:r>
+    </w:p>
+    <w:p>
+      <w:r>
+        <w:pict>
+          <v:rect style="width:0;height:1.5pt" o:hralign="center" o:hrstd="t" o:hr="t"/>
+        </w:pict>
+      </w:r>
+    </w:p>
+    <w:bookmarkEnd w:id="23"/>
+    <w:bookmarkStart w:id="24" w:name="reminders-for-whoever-picks-this-up"/>
     <w:p>
       <w:pPr>
         <w:pStyle w:val="Heading2"/>
@@ -5492,8 +6127,8 @@
         <w:t xml:space="preserve">see Section 10 above for who’s doing what as of 7/25.</w:t>
       </w:r>
     </w:p>
-    <w:bookmarkEnd w:id="23"/>
     <w:bookmarkEnd w:id="24"/>
+    <w:bookmarkEnd w:id="25"/>
     <w:sectPr>
       <w:footnotePr>
         <w:numRestart w:val="eachSect"/>

</xml_diff>

<commit_message>
Resolve Q&A-timing question, assign UI branding owner from kickoff
Jamie confirmed 25min presentation + 10min Q&A (separate) - no
rebuild needed, matches existing plan. Also reflects kickoff
decision: Francois owns UI/slide branding, Jai helping.

Co-Authored-By: Claude Sonnet 5 <noreply@anthropic.com>
</commit_message>
<xml_diff>
--- a/Presentation Planning Notes.docx
+++ b/Presentation Planning Notes.docx
@@ -157,45 +157,29 @@
           <w:b/>
           <w:bCs/>
         </w:rPr>
-        <w:t xml:space="preserve">⚠️ OPEN QUESTION, needs an answer NLT Monday 7/27:</w:t>
-      </w:r>
-      <w:r>
-        <w:t xml:space="preserve"> </w:t>
-      </w:r>
-      <w:r>
-        <w:t xml:space="preserve">is the 25 ± minutes inclusive of Q&amp;A, or presentation-only with Q&amp;A separate? This is not a minor detail — it changes the deck strategy materially. If Q&amp;A is included in the 25, the actual talking portion needs to be much shorter (something like a 10-15 min presentation + 10-15 min Q&amp;A) than if the full 25 is presentation time with Q&amp;A afterward.</w:t>
-      </w:r>
-      <w:r>
-        <w:t xml:space="preserve"> </w:t>
-      </w:r>
-      <w:r>
-        <w:rPr>
-          <w:b/>
-          <w:bCs/>
-        </w:rPr>
-        <w:t xml:space="preserve">Everything in Section 7 below is built on the assumption that the 25 (planned to ~20) is presentation-only</w:t>
-      </w:r>
-      <w:r>
-        <w:t xml:space="preserve"> </w:t>
-      </w:r>
-      <w:r>
-        <w:t xml:space="preserve">— that assumption needs to be confirmed, not treated as settled.</w:t>
-      </w:r>
-      <w:r>
-        <w:t xml:space="preserve"> </w:t>
-      </w:r>
-      <w:r>
-        <w:rPr>
-          <w:b/>
-          <w:bCs/>
-        </w:rPr>
-        <w:t xml:space="preserve">Do not wait for the Thursday 11:30am meeting with Jamie to get this answer</w:t>
-      </w:r>
-      <w:r>
-        <w:t xml:space="preserve"> </w:t>
-      </w:r>
-      <w:r>
-        <w:t xml:space="preserve">— reach out by email this weekend. Script v1 and Deck v1 (due Monday and Tuesday, see Section 11) are being built on the presentation-only assumption; if that assumption is wrong and the answer doesn’t land until later in the week, the team is looking at rebuilding the whole script and deck under real time pressure instead of a course correction.</w:t>
+        <w:t xml:space="preserve">✅ RESOLVED (7/26):</w:t>
+      </w:r>
+      <w:r>
+        <w:t xml:space="preserve"> </w:t>
+      </w:r>
+      <w:r>
+        <w:t xml:space="preserve">Jamie confirmed</w:t>
+      </w:r>
+      <w:r>
+        <w:t xml:space="preserve"> </w:t>
+      </w:r>
+      <w:r>
+        <w:rPr>
+          <w:b/>
+          <w:bCs/>
+        </w:rPr>
+        <w:t xml:space="preserve">25 minutes presentation + 10 minutes Q&amp;A, separate.</w:t>
+      </w:r>
+      <w:r>
+        <w:t xml:space="preserve"> </w:t>
+      </w:r>
+      <w:r>
+        <w:t xml:space="preserve">This matches the assumption Section 7 was already built on — no rebuild needed. The team’s ~20-minute planned target (buffer under the 25) still stands.</w:t>
       </w:r>
     </w:p>
     <w:p>
@@ -5267,18 +5251,24 @@
                 <w:b/>
                 <w:bCs/>
               </w:rPr>
-              <w:t xml:space="preserve">Unassigned, TBD</w:t>
-            </w:r>
-          </w:p>
-        </w:tc>
-        <w:tc>
-          <w:tcPr/>
-          <w:p>
-            <w:pPr>
-              <w:pStyle w:val="Compact"/>
-            </w:pPr>
-            <w:r>
-              <w:t xml:space="preserve">UI/slide branding &amp; design pass — generically Airbnb-styled look, kept consistent between the slide deck and the dashboard UI. Nobody owns this yet.</w:t>
+              <w:t xml:space="preserve">Francois</w:t>
+            </w:r>
+            <w:r>
+              <w:t xml:space="preserve"> </w:t>
+            </w:r>
+            <w:r>
+              <w:t xml:space="preserve">(Jai helping)</w:t>
+            </w:r>
+          </w:p>
+        </w:tc>
+        <w:tc>
+          <w:tcPr/>
+          <w:p>
+            <w:pPr>
+              <w:pStyle w:val="Compact"/>
+            </w:pPr>
+            <w:r>
+              <w:t xml:space="preserve">UI/slide branding &amp; design pass — generically Airbnb-styled look, kept consistent between the slide deck and the dashboard UI. Assigned at Saturday’s kickoff (7/25).</w:t>
             </w:r>
           </w:p>
         </w:tc>
@@ -5345,45 +5335,45 @@
         <w:t xml:space="preserve"> </w:t>
       </w:r>
       <w:r>
-        <w:t xml:space="preserve">3.</w:t>
-      </w:r>
-      <w:r>
-        <w:t xml:space="preserve"> </w:t>
-      </w:r>
-      <w:r>
-        <w:rPr>
-          <w:b/>
-          <w:bCs/>
-        </w:rPr>
-        <w:t xml:space="preserve">Assign an owner for UI/slide branding</w:t>
-      </w:r>
-      <w:r>
-        <w:t xml:space="preserve"> </w:t>
-      </w:r>
-      <w:r>
-        <w:t xml:space="preserve">(still TBD as of this note) — it’s now on the critical path for the demo recording (Section 11).</w:t>
-      </w:r>
-      <w:r>
-        <w:t xml:space="preserve"> </w:t>
-      </w:r>
-      <w:r>
-        <w:t xml:space="preserve">4.</w:t>
-      </w:r>
-      <w:r>
-        <w:t xml:space="preserve"> </w:t>
-      </w:r>
-      <w:r>
-        <w:rPr>
-          <w:b/>
-          <w:bCs/>
-        </w:rPr>
-        <w:t xml:space="preserve">Someone emails Jamie this weekend</w:t>
-      </w:r>
-      <w:r>
-        <w:t xml:space="preserve"> </w:t>
-      </w:r>
-      <w:r>
-        <w:t xml:space="preserve">about the Q&amp;A-timing question (Section 0) — do not wait for the Thursday meeting to ask. Need an answer no later than Monday 7/27, since that’s when Script v1 is due and it’s being built on an unconfirmed assumption.</w:t>
+        <w:t xml:space="preserve">3. ✅</w:t>
+      </w:r>
+      <w:r>
+        <w:t xml:space="preserve"> </w:t>
+      </w:r>
+      <w:r>
+        <w:rPr>
+          <w:b/>
+          <w:bCs/>
+        </w:rPr>
+        <w:t xml:space="preserve">UI/slide branding owner assigned</w:t>
+      </w:r>
+      <w:r>
+        <w:t xml:space="preserve"> </w:t>
+      </w:r>
+      <w:r>
+        <w:t xml:space="preserve">— Francois, with Jai helping (see Section 10).</w:t>
+      </w:r>
+      <w:r>
+        <w:t xml:space="preserve"> </w:t>
+      </w:r>
+      <w:r>
+        <w:t xml:space="preserve">4. ✅</w:t>
+      </w:r>
+      <w:r>
+        <w:t xml:space="preserve"> </w:t>
+      </w:r>
+      <w:r>
+        <w:rPr>
+          <w:b/>
+          <w:bCs/>
+        </w:rPr>
+        <w:t xml:space="preserve">Q&amp;A-timing question resolved</w:t>
+      </w:r>
+      <w:r>
+        <w:t xml:space="preserve"> </w:t>
+      </w:r>
+      <w:r>
+        <w:t xml:space="preserve">— see Section 0.</w:t>
       </w:r>
       <w:r>
         <w:t xml:space="preserve"> </w:t>
@@ -5518,7 +5508,7 @@
               <w:pStyle w:val="Compact"/>
             </w:pPr>
             <w:r>
-              <w:t xml:space="preserve">Kickoff (today)</w:t>
+              <w:t xml:space="preserve">Kickoff</w:t>
             </w:r>
           </w:p>
         </w:tc>
@@ -5540,7 +5530,7 @@
               <w:pStyle w:val="Compact"/>
             </w:pPr>
             <w:r>
-              <w:t xml:space="preserve">See Section 10’s agenda above. UI branding owner assigned here or ASAP after.</w:t>
+              <w:t xml:space="preserve">See Section 10’s agenda above. UI branding owner assigned: Francois (Jai helping).</w:t>
             </w:r>
           </w:p>
         </w:tc>
@@ -5594,7 +5584,7 @@
               <w:pStyle w:val="Compact"/>
             </w:pPr>
             <w:r>
-              <w:t xml:space="preserve">Jai: financial tightening + model robustness, push to land before Monday. UI: final tech pass begins. Manas/Francois/Rachael: start Script v1. Brendan: start appendices.</w:t>
+              <w:t xml:space="preserve">Jai: financial tightening + model robustness, push to land before Monday. Francois (+ Jai): UI final tech pass begins. Manas/Francois/Rachael: start Script v1. Brendan: start appendices.</w:t>
             </w:r>
           </w:p>
         </w:tc>
@@ -5648,23 +5638,7 @@
               <w:pStyle w:val="Compact"/>
             </w:pPr>
             <w:r>
-              <w:t xml:space="preserve">Discuss whether the message lands, flag narrative gaps. Status check: Jai’s financials, UI tech pass.</w:t>
-            </w:r>
-            <w:r>
-              <w:t xml:space="preserve"> </w:t>
-            </w:r>
-            <w:r>
-              <w:rPr>
-                <w:b/>
-                <w:bCs/>
-              </w:rPr>
-              <w:t xml:space="preserve">Also: is there an answer from Jamie on the Q&amp;A-timing question yet?</w:t>
-            </w:r>
-            <w:r>
-              <w:t xml:space="preserve"> </w:t>
-            </w:r>
-            <w:r>
-              <w:t xml:space="preserve">If not, this is now the top-priority follow-up — the deadline for that answer is today.</w:t>
+              <w:t xml:space="preserve">Discuss whether the message lands, flag narrative gaps. Status check: Jai’s financials, UI tech pass. Q&amp;A-timing question resolved 7/26 (see Section 0) — no rebuild needed.</w:t>
             </w:r>
           </w:p>
         </w:tc>

</xml_diff>

<commit_message>
Label model v3 as superseded, update repo status for the merge
- model v3/README_Model_V3.md: add a status header stating v3 is not what
  the deliverable runs on, what it contributed, what carried forward into
  v4 (host-tier-aware KNN, segment diagnostics), what was replaced
  (Ridge engine, heuristic confidence score), and that
  proposed-confidence-fix/ was a proposal never adopted.
- README: restore the model v3/ link now that the directory exists, mark
  all branches as fully contained in main, and add a superseded-paths
  table covering model v1-v3, the confidence-fix proposal, and ui/_archive.
- Planning Notes: record the merge and the byte-identical model v4 verification.

Co-Authored-By: Claude Opus 5 <noreply@anthropic.com>
</commit_message>
<xml_diff>
--- a/Presentation Planning Notes.docx
+++ b/Presentation Planning Notes.docx
@@ -8502,14 +8502,65 @@
           <w:b/>
           <w:bCs/>
         </w:rPr>
-        <w:t xml:space="preserve">Real branch finding (7/31):</w:t>
-      </w:r>
-      <w:r>
+        <w:t xml:space="preserve">✅ RESOLVED 7/31 —</w:t>
+      </w:r>
+      <w:r>
+        <w:rPr>
+          <w:b/>
+          <w:bCs/>
+        </w:rPr>
         <w:t xml:space="preserve"> </w:t>
       </w:r>
       <w:r>
         <w:rPr>
           <w:rStyle w:val="VerbatimChar"/>
+          <w:b/>
+          <w:bCs/>
+        </w:rPr>
+        <w:t xml:space="preserve">model v3/</w:t>
+      </w:r>
+      <w:r>
+        <w:rPr>
+          <w:b/>
+          <w:bCs/>
+        </w:rPr>
+        <w:t xml:space="preserve"> </w:t>
+      </w:r>
+      <w:r>
+        <w:rPr>
+          <w:b/>
+          <w:bCs/>
+        </w:rPr>
+        <w:t xml:space="preserve">restored to</w:t>
+      </w:r>
+      <w:r>
+        <w:rPr>
+          <w:b/>
+          <w:bCs/>
+        </w:rPr>
+        <w:t xml:space="preserve"> </w:t>
+      </w:r>
+      <w:r>
+        <w:rPr>
+          <w:rStyle w:val="VerbatimChar"/>
+          <w:b/>
+          <w:bCs/>
+        </w:rPr>
+        <w:t xml:space="preserve">main</w:t>
+      </w:r>
+      <w:r>
+        <w:rPr>
+          <w:b/>
+          <w:bCs/>
+        </w:rPr>
+        <w:t xml:space="preserve">.</w:t>
+      </w:r>
+      <w:r>
+        <w:t xml:space="preserve"> </w:t>
+      </w:r>
+      <w:r>
+        <w:rPr>
+          <w:rStyle w:val="VerbatimChar"/>
         </w:rPr>
         <w:t xml:space="preserve">origin/v3-confidence-fix-and-seasonality</w:t>
       </w:r>
@@ -8517,23 +8568,7 @@
         <w:t xml:space="preserve"> </w:t>
       </w:r>
       <w:r>
-        <w:t xml:space="preserve">is the</w:t>
-      </w:r>
-      <w:r>
-        <w:t xml:space="preserve"> </w:t>
-      </w:r>
-      <w:r>
-        <w:rPr>
-          <w:b/>
-          <w:bCs/>
-        </w:rPr>
-        <w:t xml:space="preserve">only</w:t>
-      </w:r>
-      <w:r>
-        <w:t xml:space="preserve"> </w:t>
-      </w:r>
-      <w:r>
-        <w:t xml:space="preserve">branch carrying unmerged work — it holds the entire</w:t>
+        <w:t xml:space="preserve">had been the only branch with unmerged work, holding the entire</w:t>
       </w:r>
       <w:r>
         <w:t xml:space="preserve"> </w:t>
@@ -8548,7 +8583,7 @@
         <w:t xml:space="preserve"> </w:t>
       </w:r>
       <w:r>
-        <w:t xml:space="preserve">directory (Manas’s v3 package, confidence-score fix, v3 seasonality). The root README’s version-progression table links to</w:t>
+        <w:t xml:space="preserve">directory. The root README’s version table linked to</w:t>
       </w:r>
       <w:r>
         <w:t xml:space="preserve"> </w:t>
@@ -8560,7 +8595,7 @@
         <w:t xml:space="preserve">model v3/</w:t>
       </w:r>
       <w:r>
-        <w:t xml:space="preserve">, which does not exist on</w:t>
+        <w:t xml:space="preserve">, which didn’t exist on</w:t>
       </w:r>
       <w:r>
         <w:t xml:space="preserve"> </w:t>
@@ -8572,7 +8607,7 @@
         <w:t xml:space="preserve">main</w:t>
       </w:r>
       <w:r>
-        <w:t xml:space="preserve">, so that link currently goes nowhere for a grader and the v1→v2→v3→v4 narrative the technical appendix tells has a gap in</w:t>
+        <w:t xml:space="preserve">, so that link went nowhere and the v1→v2→v3→v4 narrative had a gap. Merged 7/31 after verifying the change was purely additive (17 files, all new, all under</w:t>
       </w:r>
       <w:r>
         <w:t xml:space="preserve"> </w:t>
@@ -8581,38 +8616,87 @@
         <w:rPr>
           <w:rStyle w:val="VerbatimChar"/>
         </w:rPr>
+        <w:t xml:space="preserve">model v3/</w:t>
+      </w:r>
+      <w:r>
+        <w:t xml:space="preserve">, zero path collisions). Confirmed post-merge that the</w:t>
+      </w:r>
+      <w:r>
+        <w:t xml:space="preserve"> </w:t>
+      </w:r>
+      <w:r>
+        <w:rPr>
+          <w:rStyle w:val="VerbatimChar"/>
+        </w:rPr>
+        <w:t xml:space="preserve">model v4</w:t>
+      </w:r>
+      <w:r>
+        <w:t xml:space="preserve"> </w:t>
+      </w:r>
+      <w:r>
+        <w:t xml:space="preserve">tree hash was byte-identical before and after, so nothing the presentation depends on moved.</w:t>
+      </w:r>
+      <w:r>
+        <w:t xml:space="preserve"> </w:t>
+      </w:r>
+      <w:r>
+        <w:rPr>
+          <w:rStyle w:val="VerbatimChar"/>
+        </w:rPr>
+        <w:t xml:space="preserve">model v3/README_Model_V3.md</w:t>
+      </w:r>
+      <w:r>
+        <w:t xml:space="preserve"> </w:t>
+      </w:r>
+      <w:r>
+        <w:t xml:space="preserve">now carries a status header explaining what V3 contributed, what carried forward into V4, and that</w:t>
+      </w:r>
+      <w:r>
+        <w:t xml:space="preserve"> </w:t>
+      </w:r>
+      <w:r>
+        <w:rPr>
+          <w:rStyle w:val="VerbatimChar"/>
+        </w:rPr>
+        <w:t xml:space="preserve">proposed-confidence-fix/</w:t>
+      </w:r>
+      <w:r>
+        <w:t xml:space="preserve"> </w:t>
+      </w:r>
+      <w:r>
+        <w:t xml:space="preserve">was never adopted.</w:t>
+      </w:r>
+      <w:r>
+        <w:t xml:space="preserve"> </w:t>
+      </w:r>
+      <w:r>
+        <w:rPr>
+          <w:b/>
+          <w:bCs/>
+        </w:rPr>
+        <w:t xml:space="preserve">All branches are now fully contained in</w:t>
+      </w:r>
+      <w:r>
+        <w:rPr>
+          <w:b/>
+          <w:bCs/>
+        </w:rPr>
+        <w:t xml:space="preserve"> </w:t>
+      </w:r>
+      <w:r>
+        <w:rPr>
+          <w:rStyle w:val="VerbatimChar"/>
+          <w:b/>
+          <w:bCs/>
+        </w:rPr>
         <w:t xml:space="preserve">main</w:t>
       </w:r>
       <w:r>
+        <w:rPr>
+          <w:b/>
+          <w:bCs/>
+        </w:rPr>
         <w:t xml:space="preserve">.</w:t>
-      </w:r>
-      <w:r>
-        <w:t xml:space="preserve"> </w:t>
-      </w:r>
-      <w:r>
-        <w:rPr>
-          <w:b/>
-          <w:bCs/>
-        </w:rPr>
-        <w:t xml:space="preserve">Decision needed:</w:t>
-      </w:r>
-      <w:r>
-        <w:t xml:space="preserve"> </w:t>
-      </w:r>
-      <w:r>
-        <w:t xml:space="preserve">merge the branch to restore</w:t>
-      </w:r>
-      <w:r>
-        <w:t xml:space="preserve"> </w:t>
-      </w:r>
-      <w:r>
-        <w:rPr>
-          <w:rStyle w:val="VerbatimChar"/>
-        </w:rPr>
-        <w:t xml:space="preserve">model v3/</w:t>
-      </w:r>
-      <w:r>
-        <w:t xml:space="preserve">, or leave it and keep the README pointing at the branch.</w:t>
       </w:r>
     </w:p>
     <w:p>

</xml_diff>